<commit_message>
Add a tailored resume per job and AI tools to all resumes
Each package in 01_VAGAS now ships its own DOCX/PDF resume with headline,
summary and skills tuned to the job's keywords (experience unchanged).
Adds the AI tools Espedito uses to base resumes, answer bank, the Jeeves AI
answer and the Truelogic notes; confirms XP 'previous process' answer.

Co-Authored-By: Claude Opus 5.5 <noreply@anthropic.com>
Claude-Session: https://claude.ai/code/session_01VE1WS9pxswGhHsRfLMpnMr
</commit_message>
<xml_diff>
--- a/00_BASE/curriculo/Espedito_Roza_Product_Designer_Senior_PT.docx
+++ b/00_BASE/curriculo/Espedito_Roza_Product_Designer_Senior_PT.docx
@@ -898,6 +898,29 @@
           <w:i w:val="0"/>
           <w:sz w:val="19"/>
         </w:rPr>
+        <w:t xml:space="preserve">IA: </w:t>
+      </w:r>
+      <w:r>
+        <w:rPr>
+          <w:rFonts w:ascii="Liberation Sans" w:hAnsi="Liberation Sans" w:eastAsia="Liberation Sans"/>
+          <w:b w:val="0"/>
+          <w:i w:val="0"/>
+          <w:sz w:val="19"/>
+        </w:rPr>
+        <w:t>Claude, Claude Code, OpenAI Codex, ChatGPT, Gemini, NotebookLM, Google AI Studio, Google Stitch, Figma Make</w:t>
+      </w:r>
+    </w:p>
+    <w:p>
+      <w:pPr>
+        <w:spacing w:before="0" w:after="20" w:line="259" w:lineRule="auto"/>
+      </w:pPr>
+      <w:r>
+        <w:rPr>
+          <w:rFonts w:ascii="Liberation Sans" w:hAnsi="Liberation Sans" w:eastAsia="Liberation Sans"/>
+          <w:b/>
+          <w:i w:val="0"/>
+          <w:sz w:val="19"/>
+        </w:rPr>
         <w:t xml:space="preserve">Idiomas: </w:t>
       </w:r>
       <w:r>

</xml_diff>